<commit_message>
Adjust individual triage signal for orchestrator
</commit_message>
<xml_diff>
--- a/docs/unilateral_nda_kb.docx
+++ b/docs/unilateral_nda_kb.docx
@@ -46,15 +46,7 @@
         <w:t xml:space="preserve">Unilateral NDA concept: </w:t>
       </w:r>
       <w:r>
-        <w:t xml:space="preserve">A unilateral NDA is a one-way confidentiality agreement where only one party’s Confidential Information is </w:t>
-      </w:r>
-      <w:proofErr w:type="gramStart"/>
-      <w:r>
-        <w:t>protected</w:t>
-      </w:r>
-      <w:proofErr w:type="gramEnd"/>
-      <w:r>
-        <w:t xml:space="preserve"> and the other party is only the Receiving Party or Recipient.</w:t>
+        <w:t>A unilateral NDA is a one-way confidentiality agreement where only one party’s Confidential Information is protected and the other party is only the Receiving Party or Recipient.</w:t>
       </w:r>
     </w:p>
     <w:p>
@@ -126,7 +118,7 @@
           <w:rFonts w:ascii="Courier New" w:eastAsia="Courier New" w:hAnsi="Courier New"/>
           <w:sz w:val="18"/>
         </w:rPr>
-        <w:t>“The parties’ acknowledge and agree that Accenture may also share information with “Client” in connection with this agreement that is or should reasonably be considered as confidential to Accenture (“Accenture Confidential Information”). Any such Accenture Confidential Information will be treated and protected by the “Client” in the same manner that Client’s Confidential Information is required to be treated and protected by Accenture in this agreement.”</w:t>
+        <w:t>“The parties acknowledge and agree that Accenture may also share information with “Client” in connection with this agreement that is or should reasonably be considered as confidential to Accenture (“Accenture Confidential Information”). Any such Accenture Confidential Information will be treated and protected by the “Client” in the same manner that Client’s Confidential Information is required to be treated and protected by Accenture in this agreement.”</w:t>
       </w:r>
     </w:p>
     <w:p>
@@ -137,15 +129,7 @@
         <w:t xml:space="preserve">Implementation note: </w:t>
       </w:r>
       <w:r>
-        <w:t xml:space="preserve">For </w:t>
-      </w:r>
-      <w:proofErr w:type="spellStart"/>
-      <w:r>
-        <w:t>mitigating_language</w:t>
-      </w:r>
-      <w:proofErr w:type="spellEnd"/>
-      <w:r>
-        <w:t>, output the approved Mutuality Paragraph exactly as written in the KB. Do not replace “Client” with the counterparty name unless the KB explicitly instructs replacement.</w:t>
+        <w:t>For mitigating_language, output the approved Mutuality Paragraph exactly as written in the KB. Do not replace “Client” with the counterparty name unless the KB explicitly instructs replacement.</w:t>
       </w:r>
     </w:p>
     <w:p/>
@@ -181,21 +165,7 @@
         <w:rPr>
           <w:b/>
         </w:rPr>
-        <w:t xml:space="preserve">Always evaluate the entire </w:t>
-      </w:r>
-      <w:proofErr w:type="gramStart"/>
-      <w:r>
-        <w:rPr>
-          <w:b/>
-        </w:rPr>
-        <w:t>NDA as a whole, not</w:t>
-      </w:r>
-      <w:proofErr w:type="gramEnd"/>
-      <w:r>
-        <w:rPr>
-          <w:b/>
-        </w:rPr>
-        <w:t xml:space="preserve"> individual clauses in isolation. </w:t>
+        <w:t xml:space="preserve">Always evaluate the entire NDA as a whole, not individual clauses in isolation. </w:t>
       </w:r>
       <w:r>
         <w:t>Examine the party definitions, preamble, Confidential Information definition, disclosure mechanics, and confidentiality obligation clauses together.</w:t>
@@ -406,19 +376,11 @@
             <w:tcW w:w="3360" w:type="dxa"/>
           </w:tcPr>
           <w:p>
-            <w:proofErr w:type="spellStart"/>
             <w:r>
               <w:rPr>
                 <w:sz w:val="18"/>
               </w:rPr>
-              <w:t>risk_triggered</w:t>
-            </w:r>
-            <w:proofErr w:type="spellEnd"/>
-            <w:r>
-              <w:rPr>
-                <w:sz w:val="18"/>
-              </w:rPr>
-              <w:t xml:space="preserve"> = false; all other fields null.</w:t>
+              <w:t>risk_triggered = false; all other fields null.</w:t>
             </w:r>
           </w:p>
         </w:tc>
@@ -458,61 +420,11 @@
             <w:tcW w:w="3360" w:type="dxa"/>
           </w:tcPr>
           <w:p>
-            <w:proofErr w:type="spellStart"/>
             <w:r>
               <w:rPr>
                 <w:sz w:val="18"/>
               </w:rPr>
-              <w:t>risk_triggered</w:t>
-            </w:r>
-            <w:proofErr w:type="spellEnd"/>
-            <w:r>
-              <w:rPr>
-                <w:sz w:val="18"/>
-              </w:rPr>
-              <w:t xml:space="preserve"> = true; </w:t>
-            </w:r>
-            <w:proofErr w:type="spellStart"/>
-            <w:r>
-              <w:rPr>
-                <w:sz w:val="18"/>
-              </w:rPr>
-              <w:t>escalation_only</w:t>
-            </w:r>
-            <w:proofErr w:type="spellEnd"/>
-            <w:r>
-              <w:rPr>
-                <w:sz w:val="18"/>
-              </w:rPr>
-              <w:t xml:space="preserve"> = false; </w:t>
-            </w:r>
-            <w:proofErr w:type="spellStart"/>
-            <w:r>
-              <w:rPr>
-                <w:sz w:val="18"/>
-              </w:rPr>
-              <w:t>mitigating_language</w:t>
-            </w:r>
-            <w:proofErr w:type="spellEnd"/>
-            <w:r>
-              <w:rPr>
-                <w:sz w:val="18"/>
-              </w:rPr>
-              <w:t xml:space="preserve"> and </w:t>
-            </w:r>
-            <w:proofErr w:type="spellStart"/>
-            <w:r>
-              <w:rPr>
-                <w:sz w:val="18"/>
-              </w:rPr>
-              <w:t>clean_nda_fragment</w:t>
-            </w:r>
-            <w:proofErr w:type="spellEnd"/>
-            <w:r>
-              <w:rPr>
-                <w:sz w:val="18"/>
-              </w:rPr>
-              <w:t xml:space="preserve"> contain Mutuality Paragraph.</w:t>
+              <w:t>risk_triggered = true; escalation_only = false; mitigating_language and clean_nda_fragment contain Mutuality Paragraph.</w:t>
             </w:r>
           </w:p>
         </w:tc>
@@ -552,61 +464,11 @@
             <w:tcW w:w="3360" w:type="dxa"/>
           </w:tcPr>
           <w:p>
-            <w:proofErr w:type="spellStart"/>
             <w:r>
               <w:rPr>
                 <w:sz w:val="18"/>
               </w:rPr>
-              <w:t>risk_triggered</w:t>
-            </w:r>
-            <w:proofErr w:type="spellEnd"/>
-            <w:r>
-              <w:rPr>
-                <w:sz w:val="18"/>
-              </w:rPr>
-              <w:t xml:space="preserve"> = true; </w:t>
-            </w:r>
-            <w:proofErr w:type="spellStart"/>
-            <w:r>
-              <w:rPr>
-                <w:sz w:val="18"/>
-              </w:rPr>
-              <w:t>escalation_only</w:t>
-            </w:r>
-            <w:proofErr w:type="spellEnd"/>
-            <w:r>
-              <w:rPr>
-                <w:sz w:val="18"/>
-              </w:rPr>
-              <w:t xml:space="preserve"> = true; </w:t>
-            </w:r>
-            <w:proofErr w:type="spellStart"/>
-            <w:r>
-              <w:rPr>
-                <w:sz w:val="18"/>
-              </w:rPr>
-              <w:t>mitigating_language</w:t>
-            </w:r>
-            <w:proofErr w:type="spellEnd"/>
-            <w:r>
-              <w:rPr>
-                <w:sz w:val="18"/>
-              </w:rPr>
-              <w:t xml:space="preserve"> = Approved Mutuality Paragraph; </w:t>
-            </w:r>
-            <w:proofErr w:type="spellStart"/>
-            <w:r>
-              <w:rPr>
-                <w:sz w:val="18"/>
-              </w:rPr>
-              <w:t>clean_nda_fragment</w:t>
-            </w:r>
-            <w:proofErr w:type="spellEnd"/>
-            <w:r>
-              <w:rPr>
-                <w:sz w:val="18"/>
-              </w:rPr>
-              <w:t xml:space="preserve"> = null</w:t>
+              <w:t>risk_triggered = true; escalation_only = true; mitigating_language = Approved Mutuality Paragraph; clean_nda_fragment = null</w:t>
             </w:r>
           </w:p>
         </w:tc>
@@ -646,19 +508,11 @@
             <w:tcW w:w="3360" w:type="dxa"/>
           </w:tcPr>
           <w:p>
-            <w:proofErr w:type="spellStart"/>
             <w:r>
               <w:rPr>
                 <w:sz w:val="18"/>
               </w:rPr>
-              <w:t>risk_triggered</w:t>
-            </w:r>
-            <w:proofErr w:type="spellEnd"/>
-            <w:r>
-              <w:rPr>
-                <w:sz w:val="18"/>
-              </w:rPr>
-              <w:t xml:space="preserve"> = false for redline/remediation purposes, or mark </w:t>
+              <w:t xml:space="preserve">risk_triggered = false for redline/remediation purposes, or mark </w:t>
             </w:r>
             <w:r>
               <w:rPr>
@@ -684,21 +538,7 @@
                 <w:sz w:val="18"/>
               </w:rPr>
               <w:lastRenderedPageBreak/>
-              <w:t xml:space="preserve">RFP or proposal submission situation where the NDA is usually unilateral and likely not editable, and Accenture does not plan to share Accenture’s confidential </w:t>
-            </w:r>
-            <w:proofErr w:type="gramStart"/>
-            <w:r>
-              <w:rPr>
-                <w:sz w:val="18"/>
-              </w:rPr>
-              <w:t>information</w:t>
-            </w:r>
-            <w:proofErr w:type="gramEnd"/>
-            <w:r>
-              <w:rPr>
-                <w:sz w:val="18"/>
-              </w:rPr>
-              <w:t xml:space="preserve"> or the context makes sense for a unilateral NDA.</w:t>
+              <w:t>RFP or proposal submission situation where the NDA is usually unilateral and likely not editable, and Accenture does not plan to share Accenture’s confidential information or the context makes sense for a unilateral NDA.</w:t>
             </w:r>
           </w:p>
         </w:tc>
@@ -720,19 +560,11 @@
             <w:tcW w:w="3360" w:type="dxa"/>
           </w:tcPr>
           <w:p>
-            <w:proofErr w:type="spellStart"/>
             <w:r>
               <w:rPr>
                 <w:sz w:val="18"/>
               </w:rPr>
-              <w:t>risk_triggered</w:t>
-            </w:r>
-            <w:proofErr w:type="spellEnd"/>
-            <w:r>
-              <w:rPr>
-                <w:sz w:val="18"/>
-              </w:rPr>
-              <w:t xml:space="preserve"> = false for redline/remediation purposes, or mark as conditional note if the system supports notes.</w:t>
+              <w:t>risk_triggered = false for redline/remediation purposes, or mark as conditional note if the system supports notes.</w:t>
             </w:r>
           </w:p>
         </w:tc>
@@ -772,61 +604,11 @@
             <w:tcW w:w="3360" w:type="dxa"/>
           </w:tcPr>
           <w:p>
-            <w:proofErr w:type="spellStart"/>
             <w:r>
               <w:rPr>
                 <w:sz w:val="18"/>
               </w:rPr>
-              <w:t>risk_triggered</w:t>
-            </w:r>
-            <w:proofErr w:type="spellEnd"/>
-            <w:r>
-              <w:rPr>
-                <w:sz w:val="18"/>
-              </w:rPr>
-              <w:t xml:space="preserve"> = true; </w:t>
-            </w:r>
-            <w:proofErr w:type="spellStart"/>
-            <w:r>
-              <w:rPr>
-                <w:sz w:val="18"/>
-              </w:rPr>
-              <w:t>escalation_only</w:t>
-            </w:r>
-            <w:proofErr w:type="spellEnd"/>
-            <w:r>
-              <w:rPr>
-                <w:sz w:val="18"/>
-              </w:rPr>
-              <w:t xml:space="preserve"> = false; </w:t>
-            </w:r>
-            <w:proofErr w:type="spellStart"/>
-            <w:r>
-              <w:rPr>
-                <w:sz w:val="18"/>
-              </w:rPr>
-              <w:t>mitigating_language</w:t>
-            </w:r>
-            <w:proofErr w:type="spellEnd"/>
-            <w:r>
-              <w:rPr>
-                <w:sz w:val="18"/>
-              </w:rPr>
-              <w:t xml:space="preserve"> and </w:t>
-            </w:r>
-            <w:proofErr w:type="spellStart"/>
-            <w:r>
-              <w:rPr>
-                <w:sz w:val="18"/>
-              </w:rPr>
-              <w:t>clean_nda_fragment</w:t>
-            </w:r>
-            <w:proofErr w:type="spellEnd"/>
-            <w:r>
-              <w:rPr>
-                <w:sz w:val="18"/>
-              </w:rPr>
-              <w:t xml:space="preserve"> contain Mutuality Paragraph; reason explains that risk depends on whether Accenture will disclose confidential information.</w:t>
+              <w:t>risk_triggered = true; escalation_only = false; mitigating_language and clean_nda_fragment contain Mutuality Paragraph; reason explains that risk depends on whether Accenture will disclose confidential information.</w:t>
             </w:r>
           </w:p>
         </w:tc>
@@ -896,15 +678,7 @@
         <w:t xml:space="preserve">Important: </w:t>
       </w:r>
       <w:r>
-        <w:t xml:space="preserve">Examples must not be used alone to determine risk. Always evaluate the full document structure before </w:t>
-      </w:r>
-      <w:proofErr w:type="gramStart"/>
-      <w:r>
-        <w:t>making a determination</w:t>
-      </w:r>
-      <w:proofErr w:type="gramEnd"/>
-      <w:r>
-        <w:t>.</w:t>
+        <w:t>Examples must not be used alone to determine risk. Always evaluate the full document structure before making a determination.</w:t>
       </w:r>
     </w:p>
     <w:p>
@@ -1067,35 +841,7 @@
               <w:rPr>
                 <w:sz w:val="18"/>
               </w:rPr>
-              <w:t xml:space="preserve">“Valentino </w:t>
-            </w:r>
-            <w:proofErr w:type="spellStart"/>
-            <w:r>
-              <w:rPr>
-                <w:sz w:val="18"/>
-              </w:rPr>
-              <w:t>SpA</w:t>
-            </w:r>
-            <w:proofErr w:type="spellEnd"/>
-            <w:r>
-              <w:rPr>
-                <w:sz w:val="18"/>
-              </w:rPr>
-              <w:t xml:space="preserve"> a company incorporated and existing under the laws of Italy, with registered offices in Via Turati 16/18, 20122 Milan, tax code/VAT no.: 05412951005 (hereinafter “Disclosing Party”); and Accenture </w:t>
-            </w:r>
-            <w:proofErr w:type="spellStart"/>
-            <w:r>
-              <w:rPr>
-                <w:sz w:val="18"/>
-              </w:rPr>
-              <w:t>s.p.a</w:t>
-            </w:r>
-            <w:proofErr w:type="spellEnd"/>
-            <w:r>
-              <w:rPr>
-                <w:sz w:val="18"/>
-              </w:rPr>
-              <w:t xml:space="preserve"> a company incorporated and existing under the laws of Italy, with </w:t>
+              <w:t xml:space="preserve">“Valentino SpA a company incorporated and existing under the laws of Italy, with registered offices in Via Turati 16/18, 20122 Milan, tax code/VAT no.: 05412951005 (hereinafter “Disclosing Party”); and Accenture s.p.a a company incorporated and existing under the laws of Italy, with </w:t>
             </w:r>
             <w:r>
               <w:rPr>
@@ -1344,22 +1090,7 @@
           <w:sz w:val="18"/>
         </w:rPr>
         <w:br/>
-      </w:r>
-      <w:proofErr w:type="spellStart"/>
-      <w:r>
-        <w:rPr>
-          <w:rFonts w:ascii="Courier New" w:eastAsia="Courier New" w:hAnsi="Courier New"/>
-          <w:sz w:val="18"/>
-        </w:rPr>
-        <w:t>risk_triggered</w:t>
-      </w:r>
-      <w:proofErr w:type="spellEnd"/>
-      <w:r>
-        <w:rPr>
-          <w:rFonts w:ascii="Courier New" w:eastAsia="Courier New" w:hAnsi="Courier New"/>
-          <w:sz w:val="18"/>
-        </w:rPr>
-        <w:t>: [true/false]</w:t>
+        <w:t>risk_triggered: [true/false]</w:t>
       </w:r>
       <w:r>
         <w:rPr>
@@ -1367,22 +1098,7 @@
           <w:sz w:val="18"/>
         </w:rPr>
         <w:br/>
-      </w:r>
-      <w:proofErr w:type="spellStart"/>
-      <w:r>
-        <w:rPr>
-          <w:rFonts w:ascii="Courier New" w:eastAsia="Courier New" w:hAnsi="Courier New"/>
-          <w:sz w:val="18"/>
-        </w:rPr>
-        <w:t>escalation_only</w:t>
-      </w:r>
-      <w:proofErr w:type="spellEnd"/>
-      <w:r>
-        <w:rPr>
-          <w:rFonts w:ascii="Courier New" w:eastAsia="Courier New" w:hAnsi="Courier New"/>
-          <w:sz w:val="18"/>
-        </w:rPr>
-        <w:t>: [true/false or null]</w:t>
+        <w:t>escalation_only: [true/false or null]</w:t>
       </w:r>
       <w:r>
         <w:rPr>
@@ -1390,22 +1106,7 @@
           <w:sz w:val="18"/>
         </w:rPr>
         <w:br/>
-      </w:r>
-      <w:proofErr w:type="spellStart"/>
-      <w:r>
-        <w:rPr>
-          <w:rFonts w:ascii="Courier New" w:eastAsia="Courier New" w:hAnsi="Courier New"/>
-          <w:sz w:val="18"/>
-        </w:rPr>
-        <w:t>risk_name</w:t>
-      </w:r>
-      <w:proofErr w:type="spellEnd"/>
-      <w:r>
-        <w:rPr>
-          <w:rFonts w:ascii="Courier New" w:eastAsia="Courier New" w:hAnsi="Courier New"/>
-          <w:sz w:val="18"/>
-        </w:rPr>
-        <w:t>: [Unilateral NDA or null if not triggered]</w:t>
+        <w:t>risk_name: [Unilateral NDA or null if not triggered]</w:t>
       </w:r>
       <w:r>
         <w:rPr>
@@ -1420,22 +1121,7 @@
           <w:sz w:val="18"/>
         </w:rPr>
         <w:br/>
-      </w:r>
-      <w:proofErr w:type="spellStart"/>
-      <w:r>
-        <w:rPr>
-          <w:rFonts w:ascii="Courier New" w:eastAsia="Courier New" w:hAnsi="Courier New"/>
-          <w:sz w:val="18"/>
-        </w:rPr>
-        <w:t>original_language</w:t>
-      </w:r>
-      <w:proofErr w:type="spellEnd"/>
-      <w:r>
-        <w:rPr>
-          <w:rFonts w:ascii="Courier New" w:eastAsia="Courier New" w:hAnsi="Courier New"/>
-          <w:sz w:val="18"/>
-        </w:rPr>
-        <w:t>:</w:t>
+        <w:t>original_language:</w:t>
       </w:r>
       <w:r>
         <w:rPr>
@@ -1474,22 +1160,7 @@
           <w:sz w:val="18"/>
         </w:rPr>
         <w:br/>
-      </w:r>
-      <w:proofErr w:type="spellStart"/>
-      <w:r>
-        <w:rPr>
-          <w:rFonts w:ascii="Courier New" w:eastAsia="Courier New" w:hAnsi="Courier New"/>
-          <w:sz w:val="18"/>
-        </w:rPr>
-        <w:t>reason_for_deletion</w:t>
-      </w:r>
-      <w:proofErr w:type="spellEnd"/>
-      <w:r>
-        <w:rPr>
-          <w:rFonts w:ascii="Courier New" w:eastAsia="Courier New" w:hAnsi="Courier New"/>
-          <w:sz w:val="18"/>
-        </w:rPr>
-        <w:t>:</w:t>
+        <w:t>reason_for_deletion:</w:t>
       </w:r>
       <w:r>
         <w:rPr>
@@ -1512,22 +1183,7 @@
           <w:sz w:val="18"/>
         </w:rPr>
         <w:br/>
-      </w:r>
-      <w:proofErr w:type="spellStart"/>
-      <w:r>
-        <w:rPr>
-          <w:rFonts w:ascii="Courier New" w:eastAsia="Courier New" w:hAnsi="Courier New"/>
-          <w:sz w:val="18"/>
-        </w:rPr>
-        <w:t>mitigating_language</w:t>
-      </w:r>
-      <w:proofErr w:type="spellEnd"/>
-      <w:r>
-        <w:rPr>
-          <w:rFonts w:ascii="Courier New" w:eastAsia="Courier New" w:hAnsi="Courier New"/>
-          <w:sz w:val="18"/>
-        </w:rPr>
-        <w:t>:</w:t>
+        <w:t>mitigating_language:</w:t>
       </w:r>
       <w:r>
         <w:rPr>
@@ -1567,22 +1223,13 @@
         </w:rPr>
         <w:br/>
       </w:r>
-      <w:proofErr w:type="spellStart"/>
       <w:r>
         <w:rPr>
           <w:rFonts w:ascii="Courier New" w:eastAsia="Courier New" w:hAnsi="Courier New"/>
           <w:sz w:val="18"/>
         </w:rPr>
         <w:lastRenderedPageBreak/>
-        <w:t>clean_nda_fragment</w:t>
-      </w:r>
-      <w:proofErr w:type="spellEnd"/>
-      <w:r>
-        <w:rPr>
-          <w:rFonts w:ascii="Courier New" w:eastAsia="Courier New" w:hAnsi="Courier New"/>
-          <w:sz w:val="18"/>
-        </w:rPr>
-        <w:t>:</w:t>
+        <w:t>clean_nda_fragment:</w:t>
       </w:r>
       <w:r>
         <w:rPr>
@@ -1629,15 +1276,7 @@
         <w:pStyle w:val="ListBullet"/>
       </w:pPr>
       <w:r>
-        <w:t xml:space="preserve">Always </w:t>
-      </w:r>
-      <w:proofErr w:type="gramStart"/>
-      <w:r>
-        <w:t>return</w:t>
-      </w:r>
-      <w:proofErr w:type="gramEnd"/>
-      <w:r>
-        <w:t xml:space="preserve"> all fields.</w:t>
+        <w:t>Always return all fields.</w:t>
       </w:r>
     </w:p>
     <w:p>
@@ -1645,15 +1284,7 @@
         <w:pStyle w:val="ListBullet"/>
       </w:pPr>
       <w:r>
-        <w:t xml:space="preserve">If </w:t>
-      </w:r>
-      <w:proofErr w:type="spellStart"/>
-      <w:r>
-        <w:t>risk_triggered</w:t>
-      </w:r>
-      <w:proofErr w:type="spellEnd"/>
-      <w:r>
-        <w:t xml:space="preserve"> = false, all other fields must be null except error if processing failed.</w:t>
+        <w:t>If risk_triggered = false, all other fields must be null except error if processing failed.</w:t>
       </w:r>
     </w:p>
     <w:p>
@@ -1661,39 +1292,7 @@
         <w:pStyle w:val="ListBullet"/>
       </w:pPr>
       <w:r>
-        <w:t xml:space="preserve">If </w:t>
-      </w:r>
-      <w:proofErr w:type="spellStart"/>
-      <w:r>
-        <w:t>risk_triggered</w:t>
-      </w:r>
-      <w:proofErr w:type="spellEnd"/>
-      <w:r>
-        <w:t xml:space="preserve"> = true and mitigation is allowed, </w:t>
-      </w:r>
-      <w:proofErr w:type="spellStart"/>
-      <w:r>
-        <w:t>escalation_only</w:t>
-      </w:r>
-      <w:proofErr w:type="spellEnd"/>
-      <w:r>
-        <w:t xml:space="preserve"> must be false, </w:t>
-      </w:r>
-      <w:proofErr w:type="spellStart"/>
-      <w:r>
-        <w:t>mitigating_language</w:t>
-      </w:r>
-      <w:proofErr w:type="spellEnd"/>
-      <w:r>
-        <w:t xml:space="preserve"> must contain the approved Mutuality Paragraph, and </w:t>
-      </w:r>
-      <w:proofErr w:type="spellStart"/>
-      <w:r>
-        <w:t>clean_nda_fragment</w:t>
-      </w:r>
-      <w:proofErr w:type="spellEnd"/>
-      <w:r>
-        <w:t xml:space="preserve"> must contain the approved Mutuality Paragraph.</w:t>
+        <w:t>If risk_triggered = true and mitigation is allowed, escalation_only must be false, mitigating_language must contain the approved Mutuality Paragraph, and clean_nda_fragment must contain the approved Mutuality Paragraph.</w:t>
       </w:r>
     </w:p>
     <w:p>
@@ -1701,39 +1300,7 @@
         <w:pStyle w:val="ListBullet"/>
       </w:pPr>
       <w:r>
-        <w:t xml:space="preserve">If </w:t>
-      </w:r>
-      <w:proofErr w:type="spellStart"/>
-      <w:r>
-        <w:t>risk_triggered</w:t>
-      </w:r>
-      <w:proofErr w:type="spellEnd"/>
-      <w:r>
-        <w:t xml:space="preserve"> = true and legal review is required, </w:t>
-      </w:r>
-      <w:proofErr w:type="spellStart"/>
-      <w:r>
-        <w:t>escalation_only</w:t>
-      </w:r>
-      <w:proofErr w:type="spellEnd"/>
-      <w:r>
-        <w:t xml:space="preserve"> must be true, </w:t>
-      </w:r>
-      <w:proofErr w:type="spellStart"/>
-      <w:r>
-        <w:t>mitigating_language</w:t>
-      </w:r>
-      <w:proofErr w:type="spellEnd"/>
-      <w:r>
-        <w:t xml:space="preserve"> must be "Mandatory legal review required. No auto-mitigation permitted.", and </w:t>
-      </w:r>
-      <w:proofErr w:type="spellStart"/>
-      <w:r>
-        <w:t>clean_nda_fragment</w:t>
-      </w:r>
-      <w:proofErr w:type="spellEnd"/>
-      <w:r>
-        <w:t xml:space="preserve"> must be null.</w:t>
+        <w:t>If risk_triggered = true and legal review is required, escalation_only must be true, mitigating_language must be "Mandatory legal review required. No auto-mitigation permitted.", and clean_nda_fragment must be null.</w:t>
       </w:r>
     </w:p>
     <w:p>
@@ -1757,15 +1324,7 @@
         <w:pStyle w:val="ListBullet"/>
       </w:pPr>
       <w:r>
-        <w:t xml:space="preserve">Extract only exact clause text from the NDA for </w:t>
-      </w:r>
-      <w:proofErr w:type="spellStart"/>
-      <w:r>
-        <w:t>original_language</w:t>
-      </w:r>
-      <w:proofErr w:type="spellEnd"/>
-      <w:r>
-        <w:t>. Do not paraphrase.</w:t>
+        <w:t>Extract only exact clause text from the NDA for original_language. Do not paraphrase.</w:t>
       </w:r>
     </w:p>
     <w:p>
@@ -1804,21 +1363,8 @@
       <w:pPr>
         <w:pStyle w:val="ListBullet"/>
       </w:pPr>
-      <w:proofErr w:type="gramStart"/>
       <w:r>
-        <w:t>Base</w:t>
-      </w:r>
-      <w:proofErr w:type="gramEnd"/>
-      <w:r>
-        <w:t xml:space="preserve"> the risk determination on full document evaluation: party definitions, preamble, Confidential Information definitions, disclosure mechanics, and obligation </w:t>
-      </w:r>
-      <w:proofErr w:type="gramStart"/>
-      <w:r>
-        <w:t>clauses as a whole</w:t>
-      </w:r>
-      <w:proofErr w:type="gramEnd"/>
-      <w:r>
-        <w:t>.</w:t>
+        <w:t>Base the risk determination on full document evaluation: party definitions, preamble, Confidential Information definitions, disclosure mechanics, and obligation clauses as a whole.</w:t>
       </w:r>
     </w:p>
     <w:p>

</xml_diff>

<commit_message>
Add section 9.1 static description
</commit_message>
<xml_diff>
--- a/docs/unilateral_nda_kb.docx
+++ b/docs/unilateral_nda_kb.docx
@@ -46,7 +46,15 @@
         <w:t xml:space="preserve">Unilateral NDA concept: </w:t>
       </w:r>
       <w:r>
-        <w:t>A unilateral NDA is a one-way confidentiality agreement where only one party’s Confidential Information is protected and the other party is only the Receiving Party or Recipient.</w:t>
+        <w:t xml:space="preserve">A unilateral NDA is a one-way confidentiality agreement where only one party’s Confidential Information is </w:t>
+      </w:r>
+      <w:proofErr w:type="gramStart"/>
+      <w:r>
+        <w:t>protected</w:t>
+      </w:r>
+      <w:proofErr w:type="gramEnd"/>
+      <w:r>
+        <w:t xml:space="preserve"> and the other party is only the Receiving Party or Recipient.</w:t>
       </w:r>
     </w:p>
     <w:p>
@@ -129,7 +137,15 @@
         <w:t xml:space="preserve">Implementation note: </w:t>
       </w:r>
       <w:r>
-        <w:t>For mitigating_language, output the approved Mutuality Paragraph exactly as written in the KB. Do not replace “Client” with the counterparty name unless the KB explicitly instructs replacement.</w:t>
+        <w:t xml:space="preserve">For </w:t>
+      </w:r>
+      <w:proofErr w:type="spellStart"/>
+      <w:r>
+        <w:t>mitigating_language</w:t>
+      </w:r>
+      <w:proofErr w:type="spellEnd"/>
+      <w:r>
+        <w:t>, output the approved Mutuality Paragraph exactly as written in the KB. Do not replace “Client” with the counterparty name unless the KB explicitly instructs replacement.</w:t>
       </w:r>
     </w:p>
     <w:p/>
@@ -165,7 +181,21 @@
         <w:rPr>
           <w:b/>
         </w:rPr>
-        <w:t xml:space="preserve">Always evaluate the entire NDA as a whole, not individual clauses in isolation. </w:t>
+        <w:t xml:space="preserve">Always evaluate the entire </w:t>
+      </w:r>
+      <w:proofErr w:type="gramStart"/>
+      <w:r>
+        <w:rPr>
+          <w:b/>
+        </w:rPr>
+        <w:t>NDA as a whole, not</w:t>
+      </w:r>
+      <w:proofErr w:type="gramEnd"/>
+      <w:r>
+        <w:rPr>
+          <w:b/>
+        </w:rPr>
+        <w:t xml:space="preserve"> individual clauses in isolation. </w:t>
       </w:r>
       <w:r>
         <w:t>Examine the party definitions, preamble, Confidential Information definition, disclosure mechanics, and confidentiality obligation clauses together.</w:t>
@@ -376,11 +406,19 @@
             <w:tcW w:w="3360" w:type="dxa"/>
           </w:tcPr>
           <w:p>
+            <w:proofErr w:type="spellStart"/>
             <w:r>
               <w:rPr>
                 <w:sz w:val="18"/>
               </w:rPr>
-              <w:t>risk_triggered = false; all other fields null.</w:t>
+              <w:t>risk_triggered</w:t>
+            </w:r>
+            <w:proofErr w:type="spellEnd"/>
+            <w:r>
+              <w:rPr>
+                <w:sz w:val="18"/>
+              </w:rPr>
+              <w:t xml:space="preserve"> = false; all other fields null.</w:t>
             </w:r>
           </w:p>
         </w:tc>
@@ -420,11 +458,61 @@
             <w:tcW w:w="3360" w:type="dxa"/>
           </w:tcPr>
           <w:p>
+            <w:proofErr w:type="spellStart"/>
             <w:r>
               <w:rPr>
                 <w:sz w:val="18"/>
               </w:rPr>
-              <w:t>risk_triggered = true; escalation_only = false; mitigating_language and clean_nda_fragment contain Mutuality Paragraph.</w:t>
+              <w:t>risk_triggered</w:t>
+            </w:r>
+            <w:proofErr w:type="spellEnd"/>
+            <w:r>
+              <w:rPr>
+                <w:sz w:val="18"/>
+              </w:rPr>
+              <w:t xml:space="preserve"> = true; </w:t>
+            </w:r>
+            <w:proofErr w:type="spellStart"/>
+            <w:r>
+              <w:rPr>
+                <w:sz w:val="18"/>
+              </w:rPr>
+              <w:t>escalation_only</w:t>
+            </w:r>
+            <w:proofErr w:type="spellEnd"/>
+            <w:r>
+              <w:rPr>
+                <w:sz w:val="18"/>
+              </w:rPr>
+              <w:t xml:space="preserve"> = false; </w:t>
+            </w:r>
+            <w:proofErr w:type="spellStart"/>
+            <w:r>
+              <w:rPr>
+                <w:sz w:val="18"/>
+              </w:rPr>
+              <w:t>mitigating_language</w:t>
+            </w:r>
+            <w:proofErr w:type="spellEnd"/>
+            <w:r>
+              <w:rPr>
+                <w:sz w:val="18"/>
+              </w:rPr>
+              <w:t xml:space="preserve"> and </w:t>
+            </w:r>
+            <w:proofErr w:type="spellStart"/>
+            <w:r>
+              <w:rPr>
+                <w:sz w:val="18"/>
+              </w:rPr>
+              <w:t>clean_nda_fragment</w:t>
+            </w:r>
+            <w:proofErr w:type="spellEnd"/>
+            <w:r>
+              <w:rPr>
+                <w:sz w:val="18"/>
+              </w:rPr>
+              <w:t xml:space="preserve"> contain Mutuality Paragraph.</w:t>
             </w:r>
           </w:p>
         </w:tc>
@@ -464,11 +552,61 @@
             <w:tcW w:w="3360" w:type="dxa"/>
           </w:tcPr>
           <w:p>
+            <w:proofErr w:type="spellStart"/>
             <w:r>
               <w:rPr>
                 <w:sz w:val="18"/>
               </w:rPr>
-              <w:t>risk_triggered = true; escalation_only = true; mitigating_language = Approved Mutuality Paragraph; clean_nda_fragment = null</w:t>
+              <w:t>risk_triggered</w:t>
+            </w:r>
+            <w:proofErr w:type="spellEnd"/>
+            <w:r>
+              <w:rPr>
+                <w:sz w:val="18"/>
+              </w:rPr>
+              <w:t xml:space="preserve"> = true; </w:t>
+            </w:r>
+            <w:proofErr w:type="spellStart"/>
+            <w:r>
+              <w:rPr>
+                <w:sz w:val="18"/>
+              </w:rPr>
+              <w:t>escalation_only</w:t>
+            </w:r>
+            <w:proofErr w:type="spellEnd"/>
+            <w:r>
+              <w:rPr>
+                <w:sz w:val="18"/>
+              </w:rPr>
+              <w:t xml:space="preserve"> = true; </w:t>
+            </w:r>
+            <w:proofErr w:type="spellStart"/>
+            <w:r>
+              <w:rPr>
+                <w:sz w:val="18"/>
+              </w:rPr>
+              <w:t>mitigating_language</w:t>
+            </w:r>
+            <w:proofErr w:type="spellEnd"/>
+            <w:r>
+              <w:rPr>
+                <w:sz w:val="18"/>
+              </w:rPr>
+              <w:t xml:space="preserve"> = Approved Mutuality Paragraph; </w:t>
+            </w:r>
+            <w:proofErr w:type="spellStart"/>
+            <w:r>
+              <w:rPr>
+                <w:sz w:val="18"/>
+              </w:rPr>
+              <w:t>clean_nda_fragment</w:t>
+            </w:r>
+            <w:proofErr w:type="spellEnd"/>
+            <w:r>
+              <w:rPr>
+                <w:sz w:val="18"/>
+              </w:rPr>
+              <w:t xml:space="preserve"> = null</w:t>
             </w:r>
           </w:p>
         </w:tc>
@@ -508,11 +646,19 @@
             <w:tcW w:w="3360" w:type="dxa"/>
           </w:tcPr>
           <w:p>
+            <w:proofErr w:type="spellStart"/>
             <w:r>
               <w:rPr>
                 <w:sz w:val="18"/>
               </w:rPr>
-              <w:t xml:space="preserve">risk_triggered = false for redline/remediation purposes, or mark </w:t>
+              <w:t>risk_triggered</w:t>
+            </w:r>
+            <w:proofErr w:type="spellEnd"/>
+            <w:r>
+              <w:rPr>
+                <w:sz w:val="18"/>
+              </w:rPr>
+              <w:t xml:space="preserve"> = false for redline/remediation purposes, or mark </w:t>
             </w:r>
             <w:r>
               <w:rPr>
@@ -538,7 +684,21 @@
                 <w:sz w:val="18"/>
               </w:rPr>
               <w:lastRenderedPageBreak/>
-              <w:t>RFP or proposal submission situation where the NDA is usually unilateral and likely not editable, and Accenture does not plan to share Accenture’s confidential information or the context makes sense for a unilateral NDA.</w:t>
+              <w:t xml:space="preserve">RFP or proposal submission situation where the NDA is usually unilateral and likely not editable, and Accenture does not plan to share Accenture’s confidential </w:t>
+            </w:r>
+            <w:proofErr w:type="gramStart"/>
+            <w:r>
+              <w:rPr>
+                <w:sz w:val="18"/>
+              </w:rPr>
+              <w:t>information</w:t>
+            </w:r>
+            <w:proofErr w:type="gramEnd"/>
+            <w:r>
+              <w:rPr>
+                <w:sz w:val="18"/>
+              </w:rPr>
+              <w:t xml:space="preserve"> or the context makes sense for a unilateral NDA.</w:t>
             </w:r>
           </w:p>
         </w:tc>
@@ -560,11 +720,19 @@
             <w:tcW w:w="3360" w:type="dxa"/>
           </w:tcPr>
           <w:p>
+            <w:proofErr w:type="spellStart"/>
             <w:r>
               <w:rPr>
                 <w:sz w:val="18"/>
               </w:rPr>
-              <w:t>risk_triggered = false for redline/remediation purposes, or mark as conditional note if the system supports notes.</w:t>
+              <w:t>risk_triggered</w:t>
+            </w:r>
+            <w:proofErr w:type="spellEnd"/>
+            <w:r>
+              <w:rPr>
+                <w:sz w:val="18"/>
+              </w:rPr>
+              <w:t xml:space="preserve"> = false for redline/remediation purposes, or mark as conditional note if the system supports notes.</w:t>
             </w:r>
           </w:p>
         </w:tc>
@@ -604,11 +772,61 @@
             <w:tcW w:w="3360" w:type="dxa"/>
           </w:tcPr>
           <w:p>
+            <w:proofErr w:type="spellStart"/>
             <w:r>
               <w:rPr>
                 <w:sz w:val="18"/>
               </w:rPr>
-              <w:t>risk_triggered = true; escalation_only = false; mitigating_language and clean_nda_fragment contain Mutuality Paragraph; reason explains that risk depends on whether Accenture will disclose confidential information.</w:t>
+              <w:t>risk_triggered</w:t>
+            </w:r>
+            <w:proofErr w:type="spellEnd"/>
+            <w:r>
+              <w:rPr>
+                <w:sz w:val="18"/>
+              </w:rPr>
+              <w:t xml:space="preserve"> = true; </w:t>
+            </w:r>
+            <w:proofErr w:type="spellStart"/>
+            <w:r>
+              <w:rPr>
+                <w:sz w:val="18"/>
+              </w:rPr>
+              <w:t>escalation_only</w:t>
+            </w:r>
+            <w:proofErr w:type="spellEnd"/>
+            <w:r>
+              <w:rPr>
+                <w:sz w:val="18"/>
+              </w:rPr>
+              <w:t xml:space="preserve"> = false; </w:t>
+            </w:r>
+            <w:proofErr w:type="spellStart"/>
+            <w:r>
+              <w:rPr>
+                <w:sz w:val="18"/>
+              </w:rPr>
+              <w:t>mitigating_language</w:t>
+            </w:r>
+            <w:proofErr w:type="spellEnd"/>
+            <w:r>
+              <w:rPr>
+                <w:sz w:val="18"/>
+              </w:rPr>
+              <w:t xml:space="preserve"> and </w:t>
+            </w:r>
+            <w:proofErr w:type="spellStart"/>
+            <w:r>
+              <w:rPr>
+                <w:sz w:val="18"/>
+              </w:rPr>
+              <w:t>clean_nda_fragment</w:t>
+            </w:r>
+            <w:proofErr w:type="spellEnd"/>
+            <w:r>
+              <w:rPr>
+                <w:sz w:val="18"/>
+              </w:rPr>
+              <w:t xml:space="preserve"> contain Mutuality Paragraph; reason explains that risk depends on whether Accenture will disclose confidential information.</w:t>
             </w:r>
           </w:p>
         </w:tc>
@@ -678,7 +896,15 @@
         <w:t xml:space="preserve">Important: </w:t>
       </w:r>
       <w:r>
-        <w:t>Examples must not be used alone to determine risk. Always evaluate the full document structure before making a determination.</w:t>
+        <w:t xml:space="preserve">Examples must not be used alone to determine risk. Always evaluate the full document structure before </w:t>
+      </w:r>
+      <w:proofErr w:type="gramStart"/>
+      <w:r>
+        <w:t>making a determination</w:t>
+      </w:r>
+      <w:proofErr w:type="gramEnd"/>
+      <w:r>
+        <w:t>.</w:t>
       </w:r>
     </w:p>
     <w:p>
@@ -841,7 +1067,35 @@
               <w:rPr>
                 <w:sz w:val="18"/>
               </w:rPr>
-              <w:t xml:space="preserve">“Valentino SpA a company incorporated and existing under the laws of Italy, with registered offices in Via Turati 16/18, 20122 Milan, tax code/VAT no.: 05412951005 (hereinafter “Disclosing Party”); and Accenture s.p.a a company incorporated and existing under the laws of Italy, with </w:t>
+              <w:t xml:space="preserve">“Valentino </w:t>
+            </w:r>
+            <w:proofErr w:type="spellStart"/>
+            <w:r>
+              <w:rPr>
+                <w:sz w:val="18"/>
+              </w:rPr>
+              <w:t>SpA</w:t>
+            </w:r>
+            <w:proofErr w:type="spellEnd"/>
+            <w:r>
+              <w:rPr>
+                <w:sz w:val="18"/>
+              </w:rPr>
+              <w:t xml:space="preserve"> a company incorporated and existing under the laws of Italy, with registered offices in Via Turati 16/18, 20122 Milan, tax code/VAT no.: 05412951005 (hereinafter “Disclosing Party”); and Accenture </w:t>
+            </w:r>
+            <w:proofErr w:type="spellStart"/>
+            <w:r>
+              <w:rPr>
+                <w:sz w:val="18"/>
+              </w:rPr>
+              <w:t>s.p.a</w:t>
+            </w:r>
+            <w:proofErr w:type="spellEnd"/>
+            <w:r>
+              <w:rPr>
+                <w:sz w:val="18"/>
+              </w:rPr>
+              <w:t xml:space="preserve"> a company incorporated and existing under the laws of Italy, with </w:t>
             </w:r>
             <w:r>
               <w:rPr>
@@ -1058,6 +1312,50 @@
     </w:p>
     <w:p>
       <w:pPr>
+        <w:pStyle w:val="Heading2"/>
+        <w:rPr>
+          <w:kern w:val="2"/>
+          <w:szCs w:val="24"/>
+          <w14:ligatures w14:val="standardContextual"/>
+        </w:rPr>
+      </w:pPr>
+      <w:r>
+        <w:t>9.1 Static Screen Display Rule</w:t>
+      </w:r>
+    </w:p>
+    <w:p>
+      <w:pPr>
+        <w:rPr>
+          <w:kern w:val="2"/>
+          <w:szCs w:val="20"/>
+          <w14:ligatures w14:val="standardContextual"/>
+        </w:rPr>
+      </w:pPr>
+      <w:r>
+        <w:t>When Unilateral NDA risk is triggered, the Risk Description shown on screen must use the following static text:</w:t>
+      </w:r>
+    </w:p>
+    <w:p>
+      <w:pPr>
+        <w:spacing w:before="60" w:after="60"/>
+        <w:ind w:left="360" w:right="216"/>
+        <w:rPr>
+          <w:kern w:val="2"/>
+          <w:szCs w:val="20"/>
+          <w14:ligatures w14:val="standardContextual"/>
+        </w:rPr>
+      </w:pPr>
+      <w:r>
+        <w:rPr>
+          <w:rFonts w:ascii="Courier New" w:hAnsi="Courier New" w:cs="Courier New"/>
+          <w:sz w:val="18"/>
+          <w:szCs w:val="18"/>
+        </w:rPr>
+        <w:t>“This NDA has been identified as unilateral, meaning it does not protect Accenture’s confidential information shared with the client under this agreement.”</w:t>
+      </w:r>
+    </w:p>
+    <w:p>
+      <w:pPr>
         <w:pStyle w:val="Heading1"/>
       </w:pPr>
       <w:r>
@@ -1079,185 +1377,365 @@
       </w:pPr>
       <w:r>
         <w:rPr>
-          <w:rFonts w:ascii="Courier New" w:eastAsia="Courier New" w:hAnsi="Courier New"/>
+          <w:rFonts w:ascii="Courier New" w:hAnsi="Courier New" w:cs="Courier New"/>
           <w:sz w:val="18"/>
+          <w:szCs w:val="18"/>
         </w:rPr>
         <w:t>RESPONSE_START</w:t>
       </w:r>
       <w:r>
         <w:rPr>
-          <w:rFonts w:ascii="Courier New" w:eastAsia="Courier New" w:hAnsi="Courier New"/>
+          <w:rFonts w:ascii="Courier New" w:hAnsi="Courier New" w:cs="Courier New"/>
           <w:sz w:val="18"/>
+          <w:szCs w:val="18"/>
         </w:rPr>
         <w:br/>
-        <w:t>risk_triggered: [true/false]</w:t>
-      </w:r>
+      </w:r>
+      <w:proofErr w:type="spellStart"/>
       <w:r>
         <w:rPr>
-          <w:rFonts w:ascii="Courier New" w:eastAsia="Courier New" w:hAnsi="Courier New"/>
+          <w:rFonts w:ascii="Courier New" w:hAnsi="Courier New" w:cs="Courier New"/>
           <w:sz w:val="18"/>
+          <w:szCs w:val="18"/>
+        </w:rPr>
+        <w:t>risk_triggered</w:t>
+      </w:r>
+      <w:proofErr w:type="spellEnd"/>
+      <w:r>
+        <w:rPr>
+          <w:rFonts w:ascii="Courier New" w:hAnsi="Courier New" w:cs="Courier New"/>
+          <w:sz w:val="18"/>
+          <w:szCs w:val="18"/>
+        </w:rPr>
+        <w:t>: [true/false]</w:t>
+      </w:r>
+      <w:r>
+        <w:rPr>
+          <w:rFonts w:ascii="Courier New" w:hAnsi="Courier New" w:cs="Courier New"/>
+          <w:sz w:val="18"/>
+          <w:szCs w:val="18"/>
         </w:rPr>
         <w:br/>
-        <w:t>escalation_only: [true/false or null]</w:t>
-      </w:r>
+      </w:r>
+      <w:proofErr w:type="spellStart"/>
       <w:r>
         <w:rPr>
-          <w:rFonts w:ascii="Courier New" w:eastAsia="Courier New" w:hAnsi="Courier New"/>
+          <w:rFonts w:ascii="Courier New" w:hAnsi="Courier New" w:cs="Courier New"/>
           <w:sz w:val="18"/>
+          <w:szCs w:val="18"/>
+        </w:rPr>
+        <w:t>escalation_only</w:t>
+      </w:r>
+      <w:proofErr w:type="spellEnd"/>
+      <w:r>
+        <w:rPr>
+          <w:rFonts w:ascii="Courier New" w:hAnsi="Courier New" w:cs="Courier New"/>
+          <w:sz w:val="18"/>
+          <w:szCs w:val="18"/>
+        </w:rPr>
+        <w:t>: [true/false or null]</w:t>
+      </w:r>
+      <w:r>
+        <w:rPr>
+          <w:rFonts w:ascii="Courier New" w:hAnsi="Courier New" w:cs="Courier New"/>
+          <w:sz w:val="18"/>
+          <w:szCs w:val="18"/>
         </w:rPr>
         <w:br/>
-        <w:t>risk_name: [Unilateral NDA or null if not triggered]</w:t>
-      </w:r>
+      </w:r>
+      <w:proofErr w:type="spellStart"/>
       <w:r>
         <w:rPr>
-          <w:rFonts w:ascii="Courier New" w:eastAsia="Courier New" w:hAnsi="Courier New"/>
+          <w:rFonts w:ascii="Courier New" w:hAnsi="Courier New" w:cs="Courier New"/>
           <w:sz w:val="18"/>
+          <w:szCs w:val="18"/>
+        </w:rPr>
+        <w:t>risk_name</w:t>
+      </w:r>
+      <w:proofErr w:type="spellEnd"/>
+      <w:r>
+        <w:rPr>
+          <w:rFonts w:ascii="Courier New" w:hAnsi="Courier New" w:cs="Courier New"/>
+          <w:sz w:val="18"/>
+          <w:szCs w:val="18"/>
+        </w:rPr>
+        <w:t>: [Unilateral NDA or null if not triggered]</w:t>
+      </w:r>
+      <w:r>
+        <w:rPr>
+          <w:rFonts w:ascii="Courier New" w:hAnsi="Courier New" w:cs="Courier New"/>
+          <w:sz w:val="18"/>
+          <w:szCs w:val="18"/>
         </w:rPr>
         <w:br/>
       </w:r>
+      <w:proofErr w:type="spellStart"/>
       <w:r>
         <w:rPr>
-          <w:rFonts w:ascii="Courier New" w:eastAsia="Courier New" w:hAnsi="Courier New"/>
+          <w:rFonts w:ascii="Courier New" w:hAnsi="Courier New" w:cs="Courier New"/>
           <w:sz w:val="18"/>
+          <w:szCs w:val="18"/>
+        </w:rPr>
+        <w:t>risk_description</w:t>
+      </w:r>
+      <w:proofErr w:type="spellEnd"/>
+      <w:r>
+        <w:rPr>
+          <w:rFonts w:ascii="Courier New" w:hAnsi="Courier New" w:cs="Courier New"/>
+          <w:sz w:val="18"/>
+          <w:szCs w:val="18"/>
+        </w:rPr>
+        <w:t xml:space="preserve">: </w:t>
+      </w:r>
+      <w:r>
+        <w:rPr>
+          <w:rFonts w:ascii="Courier New" w:hAnsi="Courier New" w:cs="Courier New"/>
+          <w:sz w:val="18"/>
+          <w:szCs w:val="18"/>
+        </w:rPr>
+        <w:t xml:space="preserve">[Static Risk Description from Section 9.1 if </w:t>
+      </w:r>
+      <w:proofErr w:type="spellStart"/>
+      <w:r>
+        <w:rPr>
+          <w:rFonts w:ascii="Courier New" w:hAnsi="Courier New" w:cs="Courier New"/>
+          <w:sz w:val="18"/>
+          <w:szCs w:val="18"/>
+        </w:rPr>
+        <w:t>risk_triggered</w:t>
+      </w:r>
+      <w:proofErr w:type="spellEnd"/>
+      <w:r>
+        <w:rPr>
+          <w:rFonts w:ascii="Courier New" w:hAnsi="Courier New" w:cs="Courier New"/>
+          <w:sz w:val="18"/>
+          <w:szCs w:val="18"/>
+        </w:rPr>
+        <w:t xml:space="preserve"> = true, otherwise null.]</w:t>
+      </w:r>
+      <w:r>
+        <w:rPr>
+          <w:rFonts w:ascii="Courier New" w:hAnsi="Courier New" w:cs="Courier New"/>
+          <w:sz w:val="18"/>
+          <w:szCs w:val="18"/>
         </w:rPr>
         <w:br/>
-        <w:t>original_language:</w:t>
-      </w:r>
+      </w:r>
+      <w:proofErr w:type="spellStart"/>
       <w:r>
         <w:rPr>
-          <w:rFonts w:ascii="Courier New" w:eastAsia="Courier New" w:hAnsi="Courier New"/>
+          <w:rFonts w:ascii="Courier New" w:hAnsi="Courier New" w:cs="Courier New"/>
           <w:sz w:val="18"/>
+          <w:szCs w:val="18"/>
+        </w:rPr>
+        <w:t>original_language</w:t>
+      </w:r>
+      <w:proofErr w:type="spellEnd"/>
+      <w:r>
+        <w:rPr>
+          <w:rFonts w:ascii="Courier New" w:hAnsi="Courier New" w:cs="Courier New"/>
+          <w:sz w:val="18"/>
+          <w:szCs w:val="18"/>
+        </w:rPr>
+        <w:t>:</w:t>
+      </w:r>
+      <w:r>
+        <w:rPr>
+          <w:rFonts w:ascii="Courier New" w:hAnsi="Courier New" w:cs="Courier New"/>
+          <w:sz w:val="18"/>
+          <w:szCs w:val="18"/>
         </w:rPr>
         <w:br/>
         <w:t>[Exact original NDA clause text that indicates unilateral structure, or null if not triggered.</w:t>
       </w:r>
       <w:r>
         <w:rPr>
-          <w:rFonts w:ascii="Courier New" w:eastAsia="Courier New" w:hAnsi="Courier New"/>
+          <w:rFonts w:ascii="Courier New" w:hAnsi="Courier New" w:cs="Courier New"/>
           <w:sz w:val="18"/>
+          <w:szCs w:val="18"/>
         </w:rPr>
         <w:br/>
         <w:t>If multiple clauses are relevant, list each clause on a separate line preceded by a dash (-).</w:t>
       </w:r>
       <w:r>
         <w:rPr>
-          <w:rFonts w:ascii="Courier New" w:eastAsia="Courier New" w:hAnsi="Courier New"/>
+          <w:rFonts w:ascii="Courier New" w:hAnsi="Courier New" w:cs="Courier New"/>
           <w:sz w:val="18"/>
+          <w:szCs w:val="18"/>
         </w:rPr>
         <w:br/>
         <w:t>Preserve exact text from the NDA.]</w:t>
       </w:r>
       <w:r>
         <w:rPr>
-          <w:rFonts w:ascii="Courier New" w:eastAsia="Courier New" w:hAnsi="Courier New"/>
+          <w:rFonts w:ascii="Courier New" w:hAnsi="Courier New" w:cs="Courier New"/>
           <w:sz w:val="18"/>
+          <w:szCs w:val="18"/>
         </w:rPr>
         <w:br/>
       </w:r>
       <w:r>
         <w:rPr>
-          <w:rFonts w:ascii="Courier New" w:eastAsia="Courier New" w:hAnsi="Courier New"/>
+          <w:rFonts w:ascii="Courier New" w:hAnsi="Courier New" w:cs="Courier New"/>
           <w:sz w:val="18"/>
+          <w:szCs w:val="18"/>
         </w:rPr>
         <w:br/>
-        <w:t>reason_for_deletion:</w:t>
-      </w:r>
+      </w:r>
+      <w:proofErr w:type="spellStart"/>
       <w:r>
         <w:rPr>
-          <w:rFonts w:ascii="Courier New" w:eastAsia="Courier New" w:hAnsi="Courier New"/>
+          <w:rFonts w:ascii="Courier New" w:hAnsi="Courier New" w:cs="Courier New"/>
           <w:sz w:val="18"/>
+          <w:szCs w:val="18"/>
+        </w:rPr>
+        <w:t>reason_for_deletion</w:t>
+      </w:r>
+      <w:proofErr w:type="spellEnd"/>
+      <w:r>
+        <w:rPr>
+          <w:rFonts w:ascii="Courier New" w:hAnsi="Courier New" w:cs="Courier New"/>
+          <w:sz w:val="18"/>
+          <w:szCs w:val="18"/>
+        </w:rPr>
+        <w:t>:</w:t>
+      </w:r>
+      <w:r>
+        <w:rPr>
+          <w:rFonts w:ascii="Courier New" w:hAnsi="Courier New" w:cs="Courier New"/>
+          <w:sz w:val="18"/>
+          <w:szCs w:val="18"/>
         </w:rPr>
         <w:br/>
         <w:t>[Factual reason why the unilateral structure is problematic and the Playbook condition that applies, or null if not applicable.]</w:t>
       </w:r>
       <w:r>
         <w:rPr>
-          <w:rFonts w:ascii="Courier New" w:eastAsia="Courier New" w:hAnsi="Courier New"/>
+          <w:rFonts w:ascii="Courier New" w:hAnsi="Courier New" w:cs="Courier New"/>
           <w:sz w:val="18"/>
+          <w:szCs w:val="18"/>
         </w:rPr>
         <w:br/>
       </w:r>
       <w:r>
         <w:rPr>
-          <w:rFonts w:ascii="Courier New" w:eastAsia="Courier New" w:hAnsi="Courier New"/>
+          <w:rFonts w:ascii="Courier New" w:hAnsi="Courier New" w:cs="Courier New"/>
           <w:sz w:val="18"/>
+          <w:szCs w:val="18"/>
         </w:rPr>
+        <w:lastRenderedPageBreak/>
         <w:br/>
-        <w:t>mitigating_language:</w:t>
-      </w:r>
+      </w:r>
+      <w:proofErr w:type="spellStart"/>
       <w:r>
         <w:rPr>
-          <w:rFonts w:ascii="Courier New" w:eastAsia="Courier New" w:hAnsi="Courier New"/>
+          <w:rFonts w:ascii="Courier New" w:hAnsi="Courier New" w:cs="Courier New"/>
           <w:sz w:val="18"/>
+          <w:szCs w:val="18"/>
+        </w:rPr>
+        <w:t>mitigating_language</w:t>
+      </w:r>
+      <w:proofErr w:type="spellEnd"/>
+      <w:r>
+        <w:rPr>
+          <w:rFonts w:ascii="Courier New" w:hAnsi="Courier New" w:cs="Courier New"/>
+          <w:sz w:val="18"/>
+          <w:szCs w:val="18"/>
+        </w:rPr>
+        <w:t>:</w:t>
+      </w:r>
+      <w:r>
+        <w:rPr>
+          <w:rFonts w:ascii="Courier New" w:hAnsi="Courier New" w:cs="Courier New"/>
+          <w:sz w:val="18"/>
+          <w:szCs w:val="18"/>
         </w:rPr>
         <w:br/>
         <w:t>[The approved Mutuality Paragraph from Section 3 if Accenture intends to share confidential information or if business context is unknown, or</w:t>
       </w:r>
       <w:r>
         <w:rPr>
-          <w:rFonts w:ascii="Courier New" w:eastAsia="Courier New" w:hAnsi="Courier New"/>
+          <w:rFonts w:ascii="Courier New" w:hAnsi="Courier New" w:cs="Courier New"/>
           <w:sz w:val="18"/>
+          <w:szCs w:val="18"/>
         </w:rPr>
         <w:br/>
         <w:t>"Mandatory legal review required. No auto-mitigation permitted." if escalation-only, or</w:t>
       </w:r>
       <w:r>
         <w:rPr>
-          <w:rFonts w:ascii="Courier New" w:eastAsia="Courier New" w:hAnsi="Courier New"/>
+          <w:rFonts w:ascii="Courier New" w:hAnsi="Courier New" w:cs="Courier New"/>
           <w:sz w:val="18"/>
+          <w:szCs w:val="18"/>
         </w:rPr>
         <w:br/>
         <w:t>null if not triggered.]</w:t>
       </w:r>
       <w:r>
         <w:rPr>
-          <w:rFonts w:ascii="Courier New" w:eastAsia="Courier New" w:hAnsi="Courier New"/>
+          <w:rFonts w:ascii="Courier New" w:hAnsi="Courier New" w:cs="Courier New"/>
           <w:sz w:val="18"/>
+          <w:szCs w:val="18"/>
         </w:rPr>
         <w:br/>
       </w:r>
       <w:r>
         <w:rPr>
-          <w:rFonts w:ascii="Courier New" w:eastAsia="Courier New" w:hAnsi="Courier New"/>
+          <w:rFonts w:ascii="Courier New" w:hAnsi="Courier New" w:cs="Courier New"/>
           <w:sz w:val="18"/>
+          <w:szCs w:val="18"/>
         </w:rPr>
         <w:br/>
       </w:r>
+      <w:proofErr w:type="spellStart"/>
       <w:r>
         <w:rPr>
-          <w:rFonts w:ascii="Courier New" w:eastAsia="Courier New" w:hAnsi="Courier New"/>
+          <w:rFonts w:ascii="Courier New" w:hAnsi="Courier New" w:cs="Courier New"/>
           <w:sz w:val="18"/>
+          <w:szCs w:val="18"/>
         </w:rPr>
-        <w:lastRenderedPageBreak/>
-        <w:t>clean_nda_fragment:</w:t>
-      </w:r>
+        <w:t>clean_nda_fragment</w:t>
+      </w:r>
+      <w:proofErr w:type="spellEnd"/>
       <w:r>
         <w:rPr>
-          <w:rFonts w:ascii="Courier New" w:eastAsia="Courier New" w:hAnsi="Courier New"/>
+          <w:rFonts w:ascii="Courier New" w:hAnsi="Courier New" w:cs="Courier New"/>
           <w:sz w:val="18"/>
+          <w:szCs w:val="18"/>
+        </w:rPr>
+        <w:t>:</w:t>
+      </w:r>
+      <w:r>
+        <w:rPr>
+          <w:rFonts w:ascii="Courier New" w:hAnsi="Courier New" w:cs="Courier New"/>
+          <w:sz w:val="18"/>
+          <w:szCs w:val="18"/>
         </w:rPr>
         <w:br/>
         <w:t>[The approved Mutuality Paragraph from Section 3 if mitigation is allowed, or null if not triggered or escalation-only.]</w:t>
       </w:r>
       <w:r>
         <w:rPr>
-          <w:rFonts w:ascii="Courier New" w:eastAsia="Courier New" w:hAnsi="Courier New"/>
+          <w:rFonts w:ascii="Courier New" w:hAnsi="Courier New" w:cs="Courier New"/>
           <w:sz w:val="18"/>
+          <w:szCs w:val="18"/>
         </w:rPr>
         <w:br/>
       </w:r>
       <w:r>
         <w:rPr>
-          <w:rFonts w:ascii="Courier New" w:eastAsia="Courier New" w:hAnsi="Courier New"/>
+          <w:rFonts w:ascii="Courier New" w:hAnsi="Courier New" w:cs="Courier New"/>
           <w:sz w:val="18"/>
+          <w:szCs w:val="18"/>
         </w:rPr>
         <w:br/>
         <w:t>error: [Error message if processing failed, or null]</w:t>
       </w:r>
       <w:r>
         <w:rPr>
-          <w:rFonts w:ascii="Courier New" w:eastAsia="Courier New" w:hAnsi="Courier New"/>
+          <w:rFonts w:ascii="Courier New" w:hAnsi="Courier New" w:cs="Courier New"/>
           <w:sz w:val="18"/>
+          <w:szCs w:val="18"/>
         </w:rPr>
         <w:br/>
         <w:t>RESPONSE_END</w:t>
@@ -1276,7 +1754,15 @@
         <w:pStyle w:val="ListBullet"/>
       </w:pPr>
       <w:r>
-        <w:t>Always return all fields.</w:t>
+        <w:t xml:space="preserve">Always </w:t>
+      </w:r>
+      <w:proofErr w:type="gramStart"/>
+      <w:r>
+        <w:t>return</w:t>
+      </w:r>
+      <w:proofErr w:type="gramEnd"/>
+      <w:r>
+        <w:t xml:space="preserve"> all fields.</w:t>
       </w:r>
     </w:p>
     <w:p>
@@ -1284,7 +1770,15 @@
         <w:pStyle w:val="ListBullet"/>
       </w:pPr>
       <w:r>
-        <w:t>If risk_triggered = false, all other fields must be null except error if processing failed.</w:t>
+        <w:t xml:space="preserve">If </w:t>
+      </w:r>
+      <w:proofErr w:type="spellStart"/>
+      <w:r>
+        <w:t>risk_triggered</w:t>
+      </w:r>
+      <w:proofErr w:type="spellEnd"/>
+      <w:r>
+        <w:t xml:space="preserve"> = false, all other fields must be null except error if processing failed.</w:t>
       </w:r>
     </w:p>
     <w:p>
@@ -1292,7 +1786,39 @@
         <w:pStyle w:val="ListBullet"/>
       </w:pPr>
       <w:r>
-        <w:t>If risk_triggered = true and mitigation is allowed, escalation_only must be false, mitigating_language must contain the approved Mutuality Paragraph, and clean_nda_fragment must contain the approved Mutuality Paragraph.</w:t>
+        <w:t xml:space="preserve">If </w:t>
+      </w:r>
+      <w:proofErr w:type="spellStart"/>
+      <w:r>
+        <w:t>risk_triggered</w:t>
+      </w:r>
+      <w:proofErr w:type="spellEnd"/>
+      <w:r>
+        <w:t xml:space="preserve"> = true and mitigation is allowed, </w:t>
+      </w:r>
+      <w:proofErr w:type="spellStart"/>
+      <w:r>
+        <w:t>escalation_only</w:t>
+      </w:r>
+      <w:proofErr w:type="spellEnd"/>
+      <w:r>
+        <w:t xml:space="preserve"> must be false, </w:t>
+      </w:r>
+      <w:proofErr w:type="spellStart"/>
+      <w:r>
+        <w:t>mitigating_language</w:t>
+      </w:r>
+      <w:proofErr w:type="spellEnd"/>
+      <w:r>
+        <w:t xml:space="preserve"> must contain the approved Mutuality Paragraph, and </w:t>
+      </w:r>
+      <w:proofErr w:type="spellStart"/>
+      <w:r>
+        <w:t>clean_nda_fragment</w:t>
+      </w:r>
+      <w:proofErr w:type="spellEnd"/>
+      <w:r>
+        <w:t xml:space="preserve"> must contain the approved Mutuality Paragraph.</w:t>
       </w:r>
     </w:p>
     <w:p>
@@ -1300,7 +1826,39 @@
         <w:pStyle w:val="ListBullet"/>
       </w:pPr>
       <w:r>
-        <w:t>If risk_triggered = true and legal review is required, escalation_only must be true, mitigating_language must be "Mandatory legal review required. No auto-mitigation permitted.", and clean_nda_fragment must be null.</w:t>
+        <w:t xml:space="preserve">If </w:t>
+      </w:r>
+      <w:proofErr w:type="spellStart"/>
+      <w:r>
+        <w:t>risk_triggered</w:t>
+      </w:r>
+      <w:proofErr w:type="spellEnd"/>
+      <w:r>
+        <w:t xml:space="preserve"> = true and legal review is required, </w:t>
+      </w:r>
+      <w:proofErr w:type="spellStart"/>
+      <w:r>
+        <w:t>escalation_only</w:t>
+      </w:r>
+      <w:proofErr w:type="spellEnd"/>
+      <w:r>
+        <w:t xml:space="preserve"> must be true, </w:t>
+      </w:r>
+      <w:proofErr w:type="spellStart"/>
+      <w:r>
+        <w:t>mitigating_language</w:t>
+      </w:r>
+      <w:proofErr w:type="spellEnd"/>
+      <w:r>
+        <w:t xml:space="preserve"> must be "Mandatory legal review required. No auto-mitigation permitted.", and </w:t>
+      </w:r>
+      <w:proofErr w:type="spellStart"/>
+      <w:r>
+        <w:t>clean_nda_fragment</w:t>
+      </w:r>
+      <w:proofErr w:type="spellEnd"/>
+      <w:r>
+        <w:t xml:space="preserve"> must be null.</w:t>
       </w:r>
     </w:p>
     <w:p>
@@ -1324,7 +1882,15 @@
         <w:pStyle w:val="ListBullet"/>
       </w:pPr>
       <w:r>
-        <w:t>Extract only exact clause text from the NDA for original_language. Do not paraphrase.</w:t>
+        <w:t xml:space="preserve">Extract only exact clause text from the NDA for </w:t>
+      </w:r>
+      <w:proofErr w:type="spellStart"/>
+      <w:r>
+        <w:t>original_language</w:t>
+      </w:r>
+      <w:proofErr w:type="spellEnd"/>
+      <w:r>
+        <w:t>. Do not paraphrase.</w:t>
       </w:r>
     </w:p>
     <w:p>
@@ -1363,8 +1929,21 @@
       <w:pPr>
         <w:pStyle w:val="ListBullet"/>
       </w:pPr>
-      <w:r>
-        <w:t>Base the risk determination on full document evaluation: party definitions, preamble, Confidential Information definitions, disclosure mechanics, and obligation clauses as a whole.</w:t>
+      <w:proofErr w:type="gramStart"/>
+      <w:r>
+        <w:t>Base</w:t>
+      </w:r>
+      <w:proofErr w:type="gramEnd"/>
+      <w:r>
+        <w:t xml:space="preserve"> the risk determination on full document evaluation: party definitions, preamble, Confidential Information definitions, disclosure mechanics, and obligation </w:t>
+      </w:r>
+      <w:proofErr w:type="gramStart"/>
+      <w:r>
+        <w:t>clauses as a whole</w:t>
+      </w:r>
+      <w:proofErr w:type="gramEnd"/>
+      <w:r>
+        <w:t>.</w:t>
       </w:r>
     </w:p>
     <w:p>
@@ -1624,7 +2203,7 @@
   <w:abstractNum w:abstractNumId="8" w15:restartNumberingAfterBreak="0">
     <w:nsid w:val="FFFFFF89"/>
     <w:multiLevelType w:val="singleLevel"/>
-    <w:tmpl w:val="FD764A30"/>
+    <w:tmpl w:val="6926480A"/>
     <w:lvl w:ilvl="0">
       <w:start w:val="1"/>
       <w:numFmt w:val="bullet"/>
@@ -2287,7 +2866,6 @@
   <w:style w:type="character" w:default="1" w:styleId="DefaultParagraphFont">
     <w:name w:val="Default Paragraph Font"/>
     <w:uiPriority w:val="1"/>
-    <w:semiHidden/>
     <w:unhideWhenUsed/>
   </w:style>
   <w:style w:type="table" w:default="1" w:styleId="TableNormal">

</xml_diff>

<commit_message>
Add risk_description to the output rules
</commit_message>
<xml_diff>
--- a/docs/unilateral_nda_kb.docx
+++ b/docs/unilateral_nda_kb.docx
@@ -1752,6 +1752,11 @@
     <w:p>
       <w:pPr>
         <w:pStyle w:val="ListBullet"/>
+        <w:rPr>
+          <w:kern w:val="2"/>
+          <w:szCs w:val="20"/>
+          <w14:ligatures w14:val="standardContextual"/>
+        </w:rPr>
       </w:pPr>
       <w:r>
         <w:t xml:space="preserve">Always </w:t>
@@ -1794,31 +1799,19 @@
       </w:r>
       <w:proofErr w:type="spellEnd"/>
       <w:r>
-        <w:t xml:space="preserve"> = true and mitigation is allowed, </w:t>
+        <w:t xml:space="preserve"> = true, </w:t>
       </w:r>
       <w:proofErr w:type="spellStart"/>
       <w:r>
-        <w:t>escalation_only</w:t>
+        <w:t>risk_description</w:t>
       </w:r>
       <w:proofErr w:type="spellEnd"/>
       <w:r>
-        <w:t xml:space="preserve"> must be false, </w:t>
-      </w:r>
-      <w:proofErr w:type="spellStart"/>
-      <w:r>
-        <w:t>mitigating_language</w:t>
-      </w:r>
-      <w:proofErr w:type="spellEnd"/>
-      <w:r>
-        <w:t xml:space="preserve"> must contain the approved Mutuality Paragraph, and </w:t>
-      </w:r>
-      <w:proofErr w:type="spellStart"/>
-      <w:r>
-        <w:t>clean_nda_fragment</w:t>
-      </w:r>
-      <w:proofErr w:type="spellEnd"/>
-      <w:r>
-        <w:t xml:space="preserve"> must contain the approved Mutuality Paragraph.</w:t>
+        <w:t xml:space="preserve"> must contain the static Risk Description from Section 9.1 exactly as written:</w:t>
+      </w:r>
+      <w:r>
+        <w:br/>
+        <w:t>“This NDA has been identified as unilateral, meaning it does not protect Accenture’s confidential information shared with the client under this agreement.”</w:t>
       </w:r>
     </w:p>
     <w:p>
@@ -1834,7 +1827,7 @@
       </w:r>
       <w:proofErr w:type="spellEnd"/>
       <w:r>
-        <w:t xml:space="preserve"> = true and legal review is required, </w:t>
+        <w:t xml:space="preserve"> = true and mitigation is allowed, </w:t>
       </w:r>
       <w:proofErr w:type="spellStart"/>
       <w:r>
@@ -1842,7 +1835,7 @@
       </w:r>
       <w:proofErr w:type="spellEnd"/>
       <w:r>
-        <w:t xml:space="preserve"> must be true, </w:t>
+        <w:t xml:space="preserve"> must be false, </w:t>
       </w:r>
       <w:proofErr w:type="spellStart"/>
       <w:r>
@@ -1850,7 +1843,7 @@
       </w:r>
       <w:proofErr w:type="spellEnd"/>
       <w:r>
-        <w:t xml:space="preserve"> must be "Mandatory legal review required. No auto-mitigation permitted.", and </w:t>
+        <w:t xml:space="preserve"> must contain the approved Mutuality Paragraph, and </w:t>
       </w:r>
       <w:proofErr w:type="spellStart"/>
       <w:r>
@@ -1858,7 +1851,7 @@
       </w:r>
       <w:proofErr w:type="spellEnd"/>
       <w:r>
-        <w:t xml:space="preserve"> must be null.</w:t>
+        <w:t xml:space="preserve"> must contain the approved Mutuality Paragraph.</w:t>
       </w:r>
     </w:p>
     <w:p>
@@ -1866,7 +1859,39 @@
         <w:pStyle w:val="ListBullet"/>
       </w:pPr>
       <w:r>
-        <w:t>If the NDA is unilateral but the available context confirms Accenture will not disclose confidential information, do not create a redline risk. The proceed-as-is mitigation may be captured outside the risk output if the system supports non-risk notes.</w:t>
+        <w:t xml:space="preserve">If </w:t>
+      </w:r>
+      <w:proofErr w:type="spellStart"/>
+      <w:r>
+        <w:t>risk_triggered</w:t>
+      </w:r>
+      <w:proofErr w:type="spellEnd"/>
+      <w:r>
+        <w:t xml:space="preserve"> = true and legal review is required, </w:t>
+      </w:r>
+      <w:proofErr w:type="spellStart"/>
+      <w:r>
+        <w:t>escalation_only</w:t>
+      </w:r>
+      <w:proofErr w:type="spellEnd"/>
+      <w:r>
+        <w:t xml:space="preserve"> must be true, </w:t>
+      </w:r>
+      <w:proofErr w:type="spellStart"/>
+      <w:r>
+        <w:t>mitigating_language</w:t>
+      </w:r>
+      <w:proofErr w:type="spellEnd"/>
+      <w:r>
+        <w:t xml:space="preserve"> must contain the approved Mutuality Paragraph, and </w:t>
+      </w:r>
+      <w:proofErr w:type="spellStart"/>
+      <w:r>
+        <w:t>clean_nda_fragment</w:t>
+      </w:r>
+      <w:proofErr w:type="spellEnd"/>
+      <w:r>
+        <w:t xml:space="preserve"> must be null.</w:t>
       </w:r>
     </w:p>
     <w:p>
@@ -1874,7 +1899,7 @@
         <w:pStyle w:val="ListBullet"/>
       </w:pPr>
       <w:r>
-        <w:t>If the business context is unknown, do not state that escalation is mandatory. Treat the issue as conditional and provide the Mutuality Paragraph as the preferred mitigation.</w:t>
+        <w:t>If the NDA is unilateral but the available context confirms Accenture will not disclose confidential information, do not create a redline risk. The proceed-as-is mitigation may be captured outside the risk output if the system supports non-risk notes.</w:t>
       </w:r>
     </w:p>
     <w:p>
@@ -1882,15 +1907,7 @@
         <w:pStyle w:val="ListBullet"/>
       </w:pPr>
       <w:r>
-        <w:t xml:space="preserve">Extract only exact clause text from the NDA for </w:t>
-      </w:r>
-      <w:proofErr w:type="spellStart"/>
-      <w:r>
-        <w:t>original_language</w:t>
-      </w:r>
-      <w:proofErr w:type="spellEnd"/>
-      <w:r>
-        <w:t>. Do not paraphrase.</w:t>
+        <w:t>If the business context is unknown, do not state that escalation is mandatory. Treat the issue as conditional and provide the Mutuality Paragraph as the preferred mitigation.</w:t>
       </w:r>
     </w:p>
     <w:p>
@@ -1898,7 +1915,15 @@
         <w:pStyle w:val="ListBullet"/>
       </w:pPr>
       <w:r>
-        <w:t>If multiple clauses are relevant, list each clause on a separate line preceded by a dash (-).</w:t>
+        <w:t xml:space="preserve">Extract only exact clause text from the NDA for </w:t>
+      </w:r>
+      <w:proofErr w:type="spellStart"/>
+      <w:r>
+        <w:t>original_language</w:t>
+      </w:r>
+      <w:proofErr w:type="spellEnd"/>
+      <w:r>
+        <w:t>. Do not paraphrase.</w:t>
       </w:r>
     </w:p>
     <w:p>
@@ -1906,7 +1931,23 @@
         <w:pStyle w:val="ListBullet"/>
       </w:pPr>
       <w:r>
-        <w:t>If error occurs, set error field and set all other fields to null.</w:t>
+        <w:t>If multiple clauses are relevant, list each clause on a separate line preceded by a dash (-).</w:t>
+      </w:r>
+    </w:p>
+    <w:p>
+      <w:pPr>
+        <w:pStyle w:val="ListBullet"/>
+      </w:pPr>
+      <w:r>
+        <w:t xml:space="preserve">If error occurs, set error field and set all other fields to null, including </w:t>
+      </w:r>
+      <w:proofErr w:type="spellStart"/>
+      <w:r>
+        <w:t>risk_description</w:t>
+      </w:r>
+      <w:proofErr w:type="spellEnd"/>
+      <w:r>
+        <w:t>.</w:t>
       </w:r>
     </w:p>
     <w:p>
@@ -2203,7 +2244,7 @@
   <w:abstractNum w:abstractNumId="8" w15:restartNumberingAfterBreak="0">
     <w:nsid w:val="FFFFFF89"/>
     <w:multiLevelType w:val="singleLevel"/>
-    <w:tmpl w:val="6926480A"/>
+    <w:tmpl w:val="591632E4"/>
     <w:lvl w:ilvl="0">
       <w:start w:val="1"/>
       <w:numFmt w:val="bullet"/>
@@ -2218,6 +2259,155 @@
       </w:pPr>
       <w:rPr>
         <w:rFonts w:ascii="Symbol" w:hAnsi="Symbol" w:hint="default"/>
+      </w:rPr>
+    </w:lvl>
+  </w:abstractNum>
+  <w:abstractNum w:abstractNumId="9" w15:restartNumberingAfterBreak="0">
+    <w:nsid w:val="446E70E2"/>
+    <w:multiLevelType w:val="multilevel"/>
+    <w:tmpl w:val="9F5AD426"/>
+    <w:lvl w:ilvl="0">
+      <w:start w:val="1"/>
+      <w:numFmt w:val="bullet"/>
+      <w:lvlText w:val=""/>
+      <w:lvlJc w:val="left"/>
+      <w:pPr>
+        <w:tabs>
+          <w:tab w:val="num" w:pos="720"/>
+        </w:tabs>
+        <w:ind w:left="720" w:hanging="360"/>
+      </w:pPr>
+      <w:rPr>
+        <w:rFonts w:ascii="Symbol" w:hAnsi="Symbol" w:hint="default"/>
+        <w:sz w:val="20"/>
+      </w:rPr>
+    </w:lvl>
+    <w:lvl w:ilvl="1" w:tentative="1">
+      <w:start w:val="1"/>
+      <w:numFmt w:val="bullet"/>
+      <w:lvlText w:val=""/>
+      <w:lvlJc w:val="left"/>
+      <w:pPr>
+        <w:tabs>
+          <w:tab w:val="num" w:pos="1440"/>
+        </w:tabs>
+        <w:ind w:left="1440" w:hanging="360"/>
+      </w:pPr>
+      <w:rPr>
+        <w:rFonts w:ascii="Symbol" w:hAnsi="Symbol" w:hint="default"/>
+        <w:sz w:val="20"/>
+      </w:rPr>
+    </w:lvl>
+    <w:lvl w:ilvl="2" w:tentative="1">
+      <w:start w:val="1"/>
+      <w:numFmt w:val="bullet"/>
+      <w:lvlText w:val=""/>
+      <w:lvlJc w:val="left"/>
+      <w:pPr>
+        <w:tabs>
+          <w:tab w:val="num" w:pos="2160"/>
+        </w:tabs>
+        <w:ind w:left="2160" w:hanging="360"/>
+      </w:pPr>
+      <w:rPr>
+        <w:rFonts w:ascii="Symbol" w:hAnsi="Symbol" w:hint="default"/>
+        <w:sz w:val="20"/>
+      </w:rPr>
+    </w:lvl>
+    <w:lvl w:ilvl="3" w:tentative="1">
+      <w:start w:val="1"/>
+      <w:numFmt w:val="bullet"/>
+      <w:lvlText w:val=""/>
+      <w:lvlJc w:val="left"/>
+      <w:pPr>
+        <w:tabs>
+          <w:tab w:val="num" w:pos="2880"/>
+        </w:tabs>
+        <w:ind w:left="2880" w:hanging="360"/>
+      </w:pPr>
+      <w:rPr>
+        <w:rFonts w:ascii="Symbol" w:hAnsi="Symbol" w:hint="default"/>
+        <w:sz w:val="20"/>
+      </w:rPr>
+    </w:lvl>
+    <w:lvl w:ilvl="4" w:tentative="1">
+      <w:start w:val="1"/>
+      <w:numFmt w:val="bullet"/>
+      <w:lvlText w:val=""/>
+      <w:lvlJc w:val="left"/>
+      <w:pPr>
+        <w:tabs>
+          <w:tab w:val="num" w:pos="3600"/>
+        </w:tabs>
+        <w:ind w:left="3600" w:hanging="360"/>
+      </w:pPr>
+      <w:rPr>
+        <w:rFonts w:ascii="Symbol" w:hAnsi="Symbol" w:hint="default"/>
+        <w:sz w:val="20"/>
+      </w:rPr>
+    </w:lvl>
+    <w:lvl w:ilvl="5" w:tentative="1">
+      <w:start w:val="1"/>
+      <w:numFmt w:val="bullet"/>
+      <w:lvlText w:val=""/>
+      <w:lvlJc w:val="left"/>
+      <w:pPr>
+        <w:tabs>
+          <w:tab w:val="num" w:pos="4320"/>
+        </w:tabs>
+        <w:ind w:left="4320" w:hanging="360"/>
+      </w:pPr>
+      <w:rPr>
+        <w:rFonts w:ascii="Symbol" w:hAnsi="Symbol" w:hint="default"/>
+        <w:sz w:val="20"/>
+      </w:rPr>
+    </w:lvl>
+    <w:lvl w:ilvl="6" w:tentative="1">
+      <w:start w:val="1"/>
+      <w:numFmt w:val="bullet"/>
+      <w:lvlText w:val=""/>
+      <w:lvlJc w:val="left"/>
+      <w:pPr>
+        <w:tabs>
+          <w:tab w:val="num" w:pos="5040"/>
+        </w:tabs>
+        <w:ind w:left="5040" w:hanging="360"/>
+      </w:pPr>
+      <w:rPr>
+        <w:rFonts w:ascii="Symbol" w:hAnsi="Symbol" w:hint="default"/>
+        <w:sz w:val="20"/>
+      </w:rPr>
+    </w:lvl>
+    <w:lvl w:ilvl="7" w:tentative="1">
+      <w:start w:val="1"/>
+      <w:numFmt w:val="bullet"/>
+      <w:lvlText w:val=""/>
+      <w:lvlJc w:val="left"/>
+      <w:pPr>
+        <w:tabs>
+          <w:tab w:val="num" w:pos="5760"/>
+        </w:tabs>
+        <w:ind w:left="5760" w:hanging="360"/>
+      </w:pPr>
+      <w:rPr>
+        <w:rFonts w:ascii="Symbol" w:hAnsi="Symbol" w:hint="default"/>
+        <w:sz w:val="20"/>
+      </w:rPr>
+    </w:lvl>
+    <w:lvl w:ilvl="8" w:tentative="1">
+      <w:start w:val="1"/>
+      <w:numFmt w:val="bullet"/>
+      <w:lvlText w:val=""/>
+      <w:lvlJc w:val="left"/>
+      <w:pPr>
+        <w:tabs>
+          <w:tab w:val="num" w:pos="6480"/>
+        </w:tabs>
+        <w:ind w:left="6480" w:hanging="360"/>
+      </w:pPr>
+      <w:rPr>
+        <w:rFonts w:ascii="Symbol" w:hAnsi="Symbol" w:hint="default"/>
+        <w:sz w:val="20"/>
       </w:rPr>
     </w:lvl>
   </w:abstractNum>
@@ -2256,6 +2446,9 @@
   </w:num>
   <w:num w:numId="12" w16cid:durableId="1970626539">
     <w:abstractNumId w:val="7"/>
+  </w:num>
+  <w:num w:numId="13" w16cid:durableId="941381309">
+    <w:abstractNumId w:val="9"/>
   </w:num>
 </w:numbering>
 </file>
@@ -2866,6 +3059,7 @@
   <w:style w:type="character" w:default="1" w:styleId="DefaultParagraphFont">
     <w:name w:val="Default Paragraph Font"/>
     <w:uiPriority w:val="1"/>
+    <w:semiHidden/>
     <w:unhideWhenUsed/>
   </w:style>
   <w:style w:type="table" w:default="1" w:styleId="TableNormal">

</xml_diff>